<commit_message>
Se organizo el html y css, solo esperar al resto y se coloco una captura de pantalla nueva
</commit_message>
<xml_diff>
--- a/Capturas_del_proceso.docx
+++ b/Capturas_del_proceso.docx
@@ -29,10 +29,10 @@
       </w:pPr>
       <w:r>
         <w:drawing>
-          <wp:inline distT="0" distB="0" distL="0" distR="0" wp14:anchorId="48EF5D8D" wp14:editId="6A1C7685">
-            <wp:extent cx="5612130" cy="2532380"/>
-            <wp:effectExtent l="0" t="0" r="7620" b="1270"/>
-            <wp:docPr id="525900916" name="Imagen 1"/>
+          <wp:inline distT="0" distB="0" distL="0" distR="0" wp14:anchorId="3273F7E7" wp14:editId="26CF5EB3">
+            <wp:extent cx="4396740" cy="3508728"/>
+            <wp:effectExtent l="0" t="0" r="3810" b="0"/>
+            <wp:docPr id="1876581330" name="Imagen 1"/>
             <wp:cNvGraphicFramePr>
               <a:graphicFrameLocks xmlns:a="http://schemas.openxmlformats.org/drawingml/2006/main" noChangeAspect="1"/>
             </wp:cNvGraphicFramePr>
@@ -40,7 +40,7 @@
               <a:graphicData uri="http://schemas.openxmlformats.org/drawingml/2006/picture">
                 <pic:pic xmlns:pic="http://schemas.openxmlformats.org/drawingml/2006/picture">
                   <pic:nvPicPr>
-                    <pic:cNvPr id="525900916" name=""/>
+                    <pic:cNvPr id="1217598566" name=""/>
                     <pic:cNvPicPr/>
                   </pic:nvPicPr>
                   <pic:blipFill>
@@ -52,7 +52,7 @@
                   <pic:spPr>
                     <a:xfrm>
                       <a:off x="0" y="0"/>
-                      <a:ext cx="5612130" cy="2532380"/>
+                      <a:ext cx="4409293" cy="3518746"/>
                     </a:xfrm>
                     <a:prstGeom prst="rect">
                       <a:avLst/>
@@ -73,56 +73,11 @@
     <w:p>
       <w:pPr>
         <w:pStyle w:val="Prrafodelista"/>
-        <w:numPr>
-          <w:ilvl w:val="0"/>
-          <w:numId w:val="1"/>
-        </w:numPr>
       </w:pPr>
       <w:r>
-        <w:t>&lt;ingresar una captura de la pantalla del repositorio externo&gt;</w:t>
+        <w:t xml:space="preserve"> </w:t>
       </w:r>
     </w:p>
-    <w:p>
-      <w:r>
-        <w:drawing>
-          <wp:inline distT="0" distB="0" distL="0" distR="0" wp14:anchorId="35F6D4D2" wp14:editId="665CF9AC">
-            <wp:extent cx="5612130" cy="3118485"/>
-            <wp:effectExtent l="0" t="0" r="7620" b="5715"/>
-            <wp:docPr id="612513310" name="Imagen 1"/>
-            <wp:cNvGraphicFramePr>
-              <a:graphicFrameLocks xmlns:a="http://schemas.openxmlformats.org/drawingml/2006/main" noChangeAspect="1"/>
-            </wp:cNvGraphicFramePr>
-            <a:graphic xmlns:a="http://schemas.openxmlformats.org/drawingml/2006/main">
-              <a:graphicData uri="http://schemas.openxmlformats.org/drawingml/2006/picture">
-                <pic:pic xmlns:pic="http://schemas.openxmlformats.org/drawingml/2006/picture">
-                  <pic:nvPicPr>
-                    <pic:cNvPr id="612513310" name=""/>
-                    <pic:cNvPicPr/>
-                  </pic:nvPicPr>
-                  <pic:blipFill>
-                    <a:blip r:embed="rId6"/>
-                    <a:stretch>
-                      <a:fillRect/>
-                    </a:stretch>
-                  </pic:blipFill>
-                  <pic:spPr>
-                    <a:xfrm>
-                      <a:off x="0" y="0"/>
-                      <a:ext cx="5612130" cy="3118485"/>
-                    </a:xfrm>
-                    <a:prstGeom prst="rect">
-                      <a:avLst/>
-                    </a:prstGeom>
-                  </pic:spPr>
-                </pic:pic>
-              </a:graphicData>
-            </a:graphic>
-          </wp:inline>
-        </w:drawing>
-      </w:r>
-    </w:p>
-    <w:p/>
-    <w:p/>
     <w:sectPr>
       <w:pgSz w:w="12240" w:h="15840"/>
       <w:pgMar w:top="1417" w:right="1701" w:bottom="1417" w:left="1701" w:header="708" w:footer="708" w:gutter="0"/>

</xml_diff>

<commit_message>
Capturas terminadas por edwin, faltan las capturas del resto
</commit_message>
<xml_diff>
--- a/Capturas_del_proceso.docx
+++ b/Capturas_del_proceso.docx
@@ -28,6 +28,9 @@
         <w:jc w:val="center"/>
       </w:pPr>
       <w:r>
+        <w:rPr>
+          <w:noProof/>
+        </w:rPr>
         <w:drawing>
           <wp:inline distT="0" distB="0" distL="0" distR="0" wp14:anchorId="3273F7E7" wp14:editId="26CF5EB3">
             <wp:extent cx="4396740" cy="3508728"/>
@@ -44,7 +47,7 @@
                     <pic:cNvPicPr/>
                   </pic:nvPicPr>
                   <pic:blipFill>
-                    <a:blip r:embed="rId5"/>
+                    <a:blip r:embed="rId6"/>
                     <a:stretch>
                       <a:fillRect/>
                     </a:stretch>
@@ -90,6 +93,9 @@
         </w:rPr>
       </w:pPr>
       <w:r>
+        <w:rPr>
+          <w:noProof/>
+        </w:rPr>
         <w:drawing>
           <wp:inline distT="0" distB="0" distL="0" distR="0" wp14:anchorId="35F6D4D2" wp14:editId="0CFB4E69">
             <wp:extent cx="3756660" cy="2087458"/>
@@ -106,7 +112,7 @@
                     <pic:cNvPicPr/>
                   </pic:nvPicPr>
                   <pic:blipFill>
-                    <a:blip r:embed="rId6"/>
+                    <a:blip r:embed="rId7"/>
                     <a:stretch>
                       <a:fillRect/>
                     </a:stretch>
@@ -178,7 +184,7 @@
                     </pic:cNvPicPr>
                   </pic:nvPicPr>
                   <pic:blipFill>
-                    <a:blip r:embed="rId7">
+                    <a:blip r:embed="rId8">
                       <a:extLst>
                         <a:ext uri="{28A0092B-C50C-407E-A947-70E740481C1C}">
                           <a14:useLocalDpi xmlns:a14="http://schemas.microsoft.com/office/drawing/2010/main" val="0"/>
@@ -234,6 +240,305 @@
       <w:r>
         <w:t xml:space="preserve">Foto Edwin: </w:t>
       </w:r>
+    </w:p>
+    <w:p>
+      <w:pPr>
+        <w:pStyle w:val="Prrafodelista"/>
+      </w:pPr>
+      <w:r>
+        <w:drawing>
+          <wp:inline distT="0" distB="0" distL="0" distR="0" wp14:anchorId="14BDE133" wp14:editId="1A62CE24">
+            <wp:extent cx="5612130" cy="1642110"/>
+            <wp:effectExtent l="0" t="0" r="7620" b="0"/>
+            <wp:docPr id="462509643" name="Imagen 1"/>
+            <wp:cNvGraphicFramePr>
+              <a:graphicFrameLocks xmlns:a="http://schemas.openxmlformats.org/drawingml/2006/main" noChangeAspect="1"/>
+            </wp:cNvGraphicFramePr>
+            <a:graphic xmlns:a="http://schemas.openxmlformats.org/drawingml/2006/main">
+              <a:graphicData uri="http://schemas.openxmlformats.org/drawingml/2006/picture">
+                <pic:pic xmlns:pic="http://schemas.openxmlformats.org/drawingml/2006/picture">
+                  <pic:nvPicPr>
+                    <pic:cNvPr id="1483374431" name=""/>
+                    <pic:cNvPicPr/>
+                  </pic:nvPicPr>
+                  <pic:blipFill>
+                    <a:blip r:embed="rId9"/>
+                    <a:stretch>
+                      <a:fillRect/>
+                    </a:stretch>
+                  </pic:blipFill>
+                  <pic:spPr>
+                    <a:xfrm>
+                      <a:off x="0" y="0"/>
+                      <a:ext cx="5612130" cy="1642110"/>
+                    </a:xfrm>
+                    <a:prstGeom prst="rect">
+                      <a:avLst/>
+                    </a:prstGeom>
+                  </pic:spPr>
+                </pic:pic>
+              </a:graphicData>
+            </a:graphic>
+          </wp:inline>
+        </w:drawing>
+      </w:r>
+    </w:p>
+    <w:p>
+      <w:pPr>
+        <w:pStyle w:val="Prrafodelista"/>
+      </w:pPr>
+      <w:r>
+        <w:t xml:space="preserve">Foto de </w:t>
+      </w:r>
+      <w:proofErr w:type="spellStart"/>
+      <w:r>
+        <w:t>Sarai</w:t>
+      </w:r>
+      <w:proofErr w:type="spellEnd"/>
+      <w:r>
+        <w:t>:</w:t>
+      </w:r>
+    </w:p>
+    <w:p>
+      <w:pPr>
+        <w:pStyle w:val="Prrafodelista"/>
+      </w:pPr>
+      <w:r>
+        <w:t>Foto de Omar:</w:t>
+      </w:r>
+    </w:p>
+    <w:p>
+      <w:pPr>
+        <w:pStyle w:val="Prrafodelista"/>
+      </w:pPr>
+    </w:p>
+    <w:p>
+      <w:pPr>
+        <w:pStyle w:val="Prrafodelista"/>
+        <w:numPr>
+          <w:ilvl w:val="0"/>
+          <w:numId w:val="1"/>
+        </w:numPr>
+      </w:pPr>
+      <w:r>
+        <w:t xml:space="preserve">&lt;ingresar una captura de la consola mostrando cada comando de </w:t>
+      </w:r>
+      <w:proofErr w:type="spellStart"/>
+      <w:r>
+        <w:t>merge</w:t>
+      </w:r>
+      <w:proofErr w:type="spellEnd"/>
+      <w:r>
+        <w:t>&gt;</w:t>
+      </w:r>
+    </w:p>
+    <w:p>
+      <w:pPr>
+        <w:pStyle w:val="Prrafodelista"/>
+      </w:pPr>
+      <w:r>
+        <w:drawing>
+          <wp:inline distT="0" distB="0" distL="0" distR="0" wp14:anchorId="73C16A59" wp14:editId="267826DE">
+            <wp:extent cx="5612130" cy="804545"/>
+            <wp:effectExtent l="0" t="0" r="7620" b="0"/>
+            <wp:docPr id="881821211" name="Imagen 1"/>
+            <wp:cNvGraphicFramePr>
+              <a:graphicFrameLocks xmlns:a="http://schemas.openxmlformats.org/drawingml/2006/main" noChangeAspect="1"/>
+            </wp:cNvGraphicFramePr>
+            <a:graphic xmlns:a="http://schemas.openxmlformats.org/drawingml/2006/main">
+              <a:graphicData uri="http://schemas.openxmlformats.org/drawingml/2006/picture">
+                <pic:pic xmlns:pic="http://schemas.openxmlformats.org/drawingml/2006/picture">
+                  <pic:nvPicPr>
+                    <pic:cNvPr id="881821211" name=""/>
+                    <pic:cNvPicPr/>
+                  </pic:nvPicPr>
+                  <pic:blipFill>
+                    <a:blip r:embed="rId10"/>
+                    <a:stretch>
+                      <a:fillRect/>
+                    </a:stretch>
+                  </pic:blipFill>
+                  <pic:spPr>
+                    <a:xfrm>
+                      <a:off x="0" y="0"/>
+                      <a:ext cx="5612130" cy="804545"/>
+                    </a:xfrm>
+                    <a:prstGeom prst="rect">
+                      <a:avLst/>
+                    </a:prstGeom>
+                  </pic:spPr>
+                </pic:pic>
+              </a:graphicData>
+            </a:graphic>
+          </wp:inline>
+        </w:drawing>
+      </w:r>
+    </w:p>
+    <w:p>
+      <w:pPr>
+        <w:pStyle w:val="Prrafodelista"/>
+        <w:numPr>
+          <w:ilvl w:val="0"/>
+          <w:numId w:val="1"/>
+        </w:numPr>
+      </w:pPr>
+      <w:r>
+        <w:t xml:space="preserve">&lt;ingresar una captura del comando </w:t>
+      </w:r>
+      <w:proofErr w:type="spellStart"/>
+      <w:r>
+        <w:t>git</w:t>
+      </w:r>
+      <w:proofErr w:type="spellEnd"/>
+      <w:r>
+        <w:t xml:space="preserve"> </w:t>
+      </w:r>
+      <w:proofErr w:type="spellStart"/>
+      <w:r>
+        <w:t>branches</w:t>
+      </w:r>
+      <w:proofErr w:type="spellEnd"/>
+      <w:r>
+        <w:t xml:space="preserve"> mostrando todas las ramas</w:t>
+      </w:r>
+    </w:p>
+    <w:p>
+      <w:r>
+        <w:drawing>
+          <wp:inline distT="0" distB="0" distL="0" distR="0" wp14:anchorId="61FDE93E" wp14:editId="419F8994">
+            <wp:extent cx="5612130" cy="525780"/>
+            <wp:effectExtent l="0" t="0" r="7620" b="7620"/>
+            <wp:docPr id="1840709953" name="Imagen 1"/>
+            <wp:cNvGraphicFramePr>
+              <a:graphicFrameLocks xmlns:a="http://schemas.openxmlformats.org/drawingml/2006/main" noChangeAspect="1"/>
+            </wp:cNvGraphicFramePr>
+            <a:graphic xmlns:a="http://schemas.openxmlformats.org/drawingml/2006/main">
+              <a:graphicData uri="http://schemas.openxmlformats.org/drawingml/2006/picture">
+                <pic:pic xmlns:pic="http://schemas.openxmlformats.org/drawingml/2006/picture">
+                  <pic:nvPicPr>
+                    <pic:cNvPr id="1840709953" name=""/>
+                    <pic:cNvPicPr/>
+                  </pic:nvPicPr>
+                  <pic:blipFill>
+                    <a:blip r:embed="rId11"/>
+                    <a:stretch>
+                      <a:fillRect/>
+                    </a:stretch>
+                  </pic:blipFill>
+                  <pic:spPr>
+                    <a:xfrm>
+                      <a:off x="0" y="0"/>
+                      <a:ext cx="5612130" cy="525780"/>
+                    </a:xfrm>
+                    <a:prstGeom prst="rect">
+                      <a:avLst/>
+                    </a:prstGeom>
+                  </pic:spPr>
+                </pic:pic>
+              </a:graphicData>
+            </a:graphic>
+          </wp:inline>
+        </w:drawing>
+      </w:r>
+    </w:p>
+    <w:p>
+      <w:pPr>
+        <w:pStyle w:val="Prrafodelista"/>
+        <w:numPr>
+          <w:ilvl w:val="0"/>
+          <w:numId w:val="1"/>
+        </w:numPr>
+      </w:pPr>
+      <w:r>
+        <w:lastRenderedPageBreak/>
+        <w:t xml:space="preserve">&lt;ingresar una captura del comando </w:t>
+      </w:r>
+      <w:proofErr w:type="spellStart"/>
+      <w:r>
+        <w:t>git</w:t>
+      </w:r>
+      <w:proofErr w:type="spellEnd"/>
+      <w:r>
+        <w:t xml:space="preserve"> log </w:t>
+      </w:r>
+      <w:proofErr w:type="spellStart"/>
+      <w:r>
+        <w:t>monstrando</w:t>
+      </w:r>
+      <w:proofErr w:type="spellEnd"/>
+      <w:r>
+        <w:t xml:space="preserve"> todos los </w:t>
+      </w:r>
+      <w:proofErr w:type="spellStart"/>
+      <w:r>
+        <w:t>commits</w:t>
+      </w:r>
+      <w:proofErr w:type="spellEnd"/>
+      <w:r>
+        <w:t xml:space="preserve"> con sus comentarios correspondientes&gt;</w:t>
+      </w:r>
+    </w:p>
+    <w:p>
+      <w:r>
+        <w:drawing>
+          <wp:inline distT="0" distB="0" distL="0" distR="0" wp14:anchorId="50D6366F" wp14:editId="1795739D">
+            <wp:extent cx="5612130" cy="3914775"/>
+            <wp:effectExtent l="0" t="0" r="7620" b="9525"/>
+            <wp:docPr id="960448520" name="Imagen 1"/>
+            <wp:cNvGraphicFramePr>
+              <a:graphicFrameLocks xmlns:a="http://schemas.openxmlformats.org/drawingml/2006/main" noChangeAspect="1"/>
+            </wp:cNvGraphicFramePr>
+            <a:graphic xmlns:a="http://schemas.openxmlformats.org/drawingml/2006/main">
+              <a:graphicData uri="http://schemas.openxmlformats.org/drawingml/2006/picture">
+                <pic:pic xmlns:pic="http://schemas.openxmlformats.org/drawingml/2006/picture">
+                  <pic:nvPicPr>
+                    <pic:cNvPr id="960448520" name=""/>
+                    <pic:cNvPicPr/>
+                  </pic:nvPicPr>
+                  <pic:blipFill>
+                    <a:blip r:embed="rId12"/>
+                    <a:stretch>
+                      <a:fillRect/>
+                    </a:stretch>
+                  </pic:blipFill>
+                  <pic:spPr>
+                    <a:xfrm>
+                      <a:off x="0" y="0"/>
+                      <a:ext cx="5612130" cy="3914775"/>
+                    </a:xfrm>
+                    <a:prstGeom prst="rect">
+                      <a:avLst/>
+                    </a:prstGeom>
+                  </pic:spPr>
+                </pic:pic>
+              </a:graphicData>
+            </a:graphic>
+          </wp:inline>
+        </w:drawing>
+      </w:r>
+    </w:p>
+    <w:p/>
+    <w:p>
+      <w:r>
+        <w:t>Enlace del repositorio</w:t>
+      </w:r>
+    </w:p>
+    <w:p>
+      <w:hyperlink r:id="rId13" w:history="1">
+        <w:r>
+          <w:rPr>
+            <w:rStyle w:val="Hipervnculo"/>
+          </w:rPr>
+          <w:t>https://github.com/Edwin-Jimenez12/Asignacion1.git</w:t>
+        </w:r>
+      </w:hyperlink>
+    </w:p>
+    <w:p>
+      <w:pPr>
+        <w:rPr>
+          <w:u w:val="single"/>
+        </w:rPr>
+      </w:pPr>
     </w:p>
     <w:sectPr>
       <w:pgSz w:w="12240" w:h="15840"/>
@@ -1281,6 +1586,29 @@
       <w:spacing w:val="5"/>
     </w:rPr>
   </w:style>
+  <w:style w:type="character" w:styleId="Hipervnculo">
+    <w:name w:val="Hyperlink"/>
+    <w:basedOn w:val="Fuentedeprrafopredeter"/>
+    <w:uiPriority w:val="99"/>
+    <w:unhideWhenUsed/>
+    <w:rsid w:val="00035A2F"/>
+    <w:rPr>
+      <w:color w:val="467886" w:themeColor="hyperlink"/>
+      <w:u w:val="single"/>
+    </w:rPr>
+  </w:style>
+  <w:style w:type="character" w:styleId="Mencinsinresolver">
+    <w:name w:val="Unresolved Mention"/>
+    <w:basedOn w:val="Fuentedeprrafopredeter"/>
+    <w:uiPriority w:val="99"/>
+    <w:semiHidden/>
+    <w:unhideWhenUsed/>
+    <w:rsid w:val="00035A2F"/>
+    <w:rPr>
+      <w:color w:val="605E5C"/>
+      <w:shd w:val="clear" w:color="auto" w:fill="E1DFDD"/>
+    </w:rPr>
+  </w:style>
 </w:styles>
 </file>
 
@@ -1577,4 +1905,16 @@
     </a:ext>
   </a:extLst>
 </a:theme>
+</file>
+
+<file path=customXml/item1.xml><?xml version="1.0" encoding="utf-8"?>
+<b:Sources xmlns:b="http://schemas.openxmlformats.org/officeDocument/2006/bibliography" xmlns="http://schemas.openxmlformats.org/officeDocument/2006/bibliography" SelectedStyle="\APASixthEditionOfficeOnline.xsl" StyleName="APA" Version="6"/>
+</file>
+
+<file path=customXml/itemProps1.xml><?xml version="1.0" encoding="utf-8"?>
+<ds:datastoreItem xmlns:ds="http://schemas.openxmlformats.org/officeDocument/2006/customXml" ds:itemID="{AE255783-F245-4070-AA31-C3D4FE3D02FB}">
+  <ds:schemaRefs>
+    <ds:schemaRef ds:uri="http://schemas.openxmlformats.org/officeDocument/2006/bibliography"/>
+  </ds:schemaRefs>
+</ds:datastoreItem>
 </file>
</xml_diff>